<commit_message>
Correct current COLSA role: AI SME for DEVCOM AvMC Software Assurance team; 40+ team leadership moved to past tense
</commit_message>
<xml_diff>
--- a/docs/resume_v2_draft.docx
+++ b/docs/resume_v2_draft.docx
@@ -44,7 +44,7 @@
         <w:pStyle w:val="FirstParagraph"/>
       </w:pPr>
       <w:r>
-        <w:t xml:space="preserve">Senior technical leader and applied AI engineer with 11 years across machine learning, robotics, cybersecurity, and autonomous systems. Currently leads a 40+ person distributed engineering organization shipping production ML platforms in compliance-bounded deployments. PhD research at Purdue on operational behavior of frontier LLMs in offline / air-gapped environments.</w:t>
+        <w:t xml:space="preserve">Senior technical leader and applied AI engineer with 11 years across machine learning, robotics, cybersecurity, and autonomous systems. Currently AI Subject Matter Expert for the DEVCOM AvMC Software Assurance team — technical authority on AI/ML integration in Army aviation and missile software programs. Earlier in my COLSA tenure: led a 40+ person distributed engineering organization delivering containerized ML platforms. PhD research at Purdue on operational behavior of frontier LLMs in offline / air-gapped environments.</w:t>
       </w:r>
       <w:r>
         <w:t xml:space="preserve"> </w:t>
@@ -126,23 +126,33 @@
         </w:numPr>
       </w:pPr>
       <w:r>
-        <w:t xml:space="preserve">Technical lead for a distributed organization of</w:t>
-      </w:r>
-      <w:r>
-        <w:t xml:space="preserve"> </w:t>
-      </w:r>
-      <w:r>
         <w:rPr>
           <w:b/>
           <w:bCs/>
         </w:rPr>
-        <w:t xml:space="preserve">40+</w:t>
-      </w:r>
-      <w:r>
-        <w:t xml:space="preserve"> </w:t>
-      </w:r>
-      <w:r>
-        <w:t xml:space="preserve">engineers and scientists shipping containerized ML platforms across multiple programs.</w:t>
+        <w:t xml:space="preserve">Current:</w:t>
+      </w:r>
+      <w:r>
+        <w:t xml:space="preserve"> </w:t>
+      </w:r>
+      <w:r>
+        <w:t xml:space="preserve">AI Subject Matter Expert for the</w:t>
+      </w:r>
+      <w:r>
+        <w:t xml:space="preserve"> </w:t>
+      </w:r>
+      <w:r>
+        <w:rPr>
+          <w:b/>
+          <w:bCs/>
+        </w:rPr>
+        <w:t xml:space="preserve">DEVCOM AvMC Software Assurance</w:t>
+      </w:r>
+      <w:r>
+        <w:t xml:space="preserve"> </w:t>
+      </w:r>
+      <w:r>
+        <w:t xml:space="preserve">team — technical authority on AI/ML integration into the software-assurance mission for U.S. Army aviation and missile software programs. Advises on model selection, deployment patterns, evaluation, and security implications of LLM-enabled tooling.</w:t>
       </w:r>
     </w:p>
     <w:p>
@@ -154,7 +164,33 @@
         </w:numPr>
       </w:pPr>
       <w:r>
-        <w:t xml:space="preserve">Architected production ML pipelines for real-time signal characterization, anomaly detection, and geolocation across high-throughput RF data streams; deployed via CI/CD MLOps under strict compliance and operational constraints.</w:t>
+        <w:rPr>
+          <w:b/>
+          <w:bCs/>
+        </w:rPr>
+        <w:t xml:space="preserve">Earlier in tenure:</w:t>
+      </w:r>
+      <w:r>
+        <w:t xml:space="preserve"> </w:t>
+      </w:r>
+      <w:r>
+        <w:t xml:space="preserve">Led a team-of-teams of</w:t>
+      </w:r>
+      <w:r>
+        <w:t xml:space="preserve"> </w:t>
+      </w:r>
+      <w:r>
+        <w:rPr>
+          <w:b/>
+          <w:bCs/>
+        </w:rPr>
+        <w:t xml:space="preserve">40+</w:t>
+      </w:r>
+      <w:r>
+        <w:t xml:space="preserve"> </w:t>
+      </w:r>
+      <w:r>
+        <w:t xml:space="preserve">distributed multidisciplinary STEM SMEs delivering containerized ML platforms — real-time signal characterization, anomaly detection, and geolocation across high-throughput RF data streams. Scaled Agile CI/CD MLOps in compliance-bounded environments.</w:t>
       </w:r>
     </w:p>
     <w:p>
@@ -166,7 +202,7 @@
         </w:numPr>
       </w:pPr>
       <w:r>
-        <w:t xml:space="preserve">Designed and operated team development + production infrastructure end-to-end: hybrid cloud architecture, on-prem hardware, data pipelines, container orchestration.</w:t>
+        <w:t xml:space="preserve">Designed and operated team development + production infrastructure end-to-end across both phases: hybrid cloud architecture, on-prem hardware, data pipelines, container orchestration.</w:t>
       </w:r>
     </w:p>
     <w:p>
@@ -178,7 +214,7 @@
         </w:numPr>
       </w:pPr>
       <w:r>
-        <w:t xml:space="preserve">Recruited, hired, mentored, and led technical staff across multiple disciplines; led growth of the Data Science Division.</w:t>
+        <w:t xml:space="preserve">Recruited, hired, mentored, and led technical staff during the leadership phase; drove growth of the Data Science Division.</w:t>
       </w:r>
     </w:p>
     <w:p>
@@ -190,7 +226,7 @@
         </w:numPr>
       </w:pPr>
       <w:r>
-        <w:t xml:space="preserve">Customer-facing technical lead — stakeholder presentations, monthly status reporting, scoping + negotiation across concurrent programs.</w:t>
+        <w:t xml:space="preserve">Customer-facing throughout — stakeholder presentations, monthly status reports, scoping + negotiation across concurrent Army programs.</w:t>
       </w:r>
     </w:p>
     <w:bookmarkEnd w:id="10"/>

</xml_diff>

<commit_message>
Site: add AI-tools-for-software-assurance, teaching, communities of practice
</commit_message>
<xml_diff>
--- a/docs/resume_v2_draft.docx
+++ b/docs/resume_v2_draft.docx
@@ -2,7 +2,7 @@
 <file path=word/document.xml><?xml version="1.0" encoding="utf-8"?>
 <w:document xmlns:w="http://schemas.openxmlformats.org/wordprocessingml/2006/main" xmlns:m="http://schemas.openxmlformats.org/officeDocument/2006/math" xmlns:r="http://schemas.openxmlformats.org/officeDocument/2006/relationships" xmlns:o="urn:schemas-microsoft-com:office:office" xmlns:v="urn:schemas-microsoft-com:vml" xmlns:w10="urn:schemas-microsoft-com:office:word" xmlns:a="http://schemas.openxmlformats.org/drawingml/2006/main" xmlns:pic="http://schemas.openxmlformats.org/drawingml/2006/picture" xmlns:wp="http://schemas.openxmlformats.org/drawingml/2006/wordprocessingDrawing">
   <w:body>
-    <w:bookmarkStart w:id="20" w:name="ian-myles-bragg"/>
+    <w:bookmarkStart w:id="21" w:name="ian-myles-bragg"/>
     <w:p>
       <w:pPr>
         <w:pStyle w:val="Heading1"/>
@@ -44,7 +44,7 @@
         <w:pStyle w:val="FirstParagraph"/>
       </w:pPr>
       <w:r>
-        <w:t xml:space="preserve">Senior technical leader and applied AI engineer with 11 years across machine learning, robotics, cybersecurity, and autonomous systems. Currently AI Subject Matter Expert for the DEVCOM AvMC Software Assurance team — technical authority on AI/ML integration in Army aviation and missile software programs. Earlier in my COLSA tenure: led a 40+ person distributed engineering organization delivering containerized ML platforms. PhD research at Purdue on operational behavior of frontier LLMs in offline / air-gapped environments.</w:t>
+        <w:t xml:space="preserve">Senior applied AI engineer with 11 years across machine learning, robotics, cybersecurity, and autonomous systems. Currently AI Subject Matter Expert for the DEVCOM AvMC Software Assurance team — designing and building AI-augmented software-assurance tooling: LLM/RAG pipelines over CWE/CVE corpora, Code Property Graph and AST-based static analysis, knowledge graphs, assurance dashboards, and federated artifact-management research. Earlier in my COLSA tenure: led a 40+ person distributed engineering organization delivering containerized ML platforms. PhD research at Purdue on operational behavior of frontier LLMs in offline / air-gapped environments.</w:t>
       </w:r>
       <w:r>
         <w:t xml:space="preserve"> </w:t>
@@ -76,7 +76,7 @@
         <w:t xml:space="preserve"> </w:t>
       </w:r>
       <w:r>
-        <w:t xml:space="preserve">and B.S. in Information Assurance — applied AI with security depth that’s rare to find together.</w:t>
+        <w:t xml:space="preserve">and B.S. in Information Assurance — applied AI with real security depth.</w:t>
       </w:r>
     </w:p>
     <w:p>
@@ -152,7 +152,79 @@
         <w:t xml:space="preserve"> </w:t>
       </w:r>
       <w:r>
-        <w:t xml:space="preserve">team — technical authority on AI/ML integration into the software-assurance mission for U.S. Army aviation and missile software programs. Advises on model selection, deployment patterns, evaluation, and security implications of LLM-enabled tooling.</w:t>
+        <w:t xml:space="preserve">team. Design and build AI-augmented software-assurance tooling for U.S. Army aviation and missile programs across:</w:t>
+      </w:r>
+    </w:p>
+    <w:p>
+      <w:pPr>
+        <w:pStyle w:val="Compact"/>
+        <w:numPr>
+          <w:ilvl w:val="1"/>
+          <w:numId w:val="1003"/>
+        </w:numPr>
+      </w:pPr>
+      <w:r>
+        <w:t xml:space="preserve">LLM + RAG pipelines over CWE / CVE / software-assurance reference corpora</w:t>
+      </w:r>
+    </w:p>
+    <w:p>
+      <w:pPr>
+        <w:pStyle w:val="Compact"/>
+        <w:numPr>
+          <w:ilvl w:val="1"/>
+          <w:numId w:val="1003"/>
+        </w:numPr>
+      </w:pPr>
+      <w:r>
+        <w:t xml:space="preserve">Code Property Graph (CPG) and AST-based static-analysis tooling</w:t>
+      </w:r>
+    </w:p>
+    <w:p>
+      <w:pPr>
+        <w:pStyle w:val="Compact"/>
+        <w:numPr>
+          <w:ilvl w:val="1"/>
+          <w:numId w:val="1003"/>
+        </w:numPr>
+      </w:pPr>
+      <w:r>
+        <w:t xml:space="preserve">Knowledge graphs for cross-artifact relationships</w:t>
+      </w:r>
+    </w:p>
+    <w:p>
+      <w:pPr>
+        <w:pStyle w:val="Compact"/>
+        <w:numPr>
+          <w:ilvl w:val="1"/>
+          <w:numId w:val="1003"/>
+        </w:numPr>
+      </w:pPr>
+      <w:r>
+        <w:t xml:space="preserve">Assurance dashboards + automated repository management</w:t>
+      </w:r>
+    </w:p>
+    <w:p>
+      <w:pPr>
+        <w:pStyle w:val="Compact"/>
+        <w:numPr>
+          <w:ilvl w:val="1"/>
+          <w:numId w:val="1003"/>
+        </w:numPr>
+      </w:pPr>
+      <w:r>
+        <w:t xml:space="preserve">Federated software-assurance artifacts management (research-level)</w:t>
+      </w:r>
+    </w:p>
+    <w:p>
+      <w:pPr>
+        <w:pStyle w:val="Compact"/>
+        <w:numPr>
+          <w:ilvl w:val="1"/>
+          <w:numId w:val="1003"/>
+        </w:numPr>
+      </w:pPr>
+      <w:r>
+        <w:t xml:space="preserve">Technical paper authorship on federated artifact management and related topics</w:t>
       </w:r>
     </w:p>
     <w:p>
@@ -168,22 +240,44 @@
           <w:b/>
           <w:bCs/>
         </w:rPr>
-        <w:t xml:space="preserve">Earlier in tenure:</w:t>
-      </w:r>
-      <w:r>
-        <w:t xml:space="preserve"> </w:t>
-      </w:r>
-      <w:r>
-        <w:t xml:space="preserve">Led a team-of-teams of</w:t>
-      </w:r>
-      <w:r>
-        <w:t xml:space="preserve"> </w:t>
-      </w:r>
+        <w:t xml:space="preserve">Teaching:</w:t>
+      </w:r>
+      <w:r>
+        <w:t xml:space="preserve"> </w:t>
+      </w:r>
+      <w:r>
+        <w:t xml:space="preserve">Develop and deliver courses on AI capabilities and limitations, data literacy, and automation — for internal team and customer audiences.</w:t>
+      </w:r>
+    </w:p>
+    <w:p>
+      <w:pPr>
+        <w:pStyle w:val="Compact"/>
+        <w:numPr>
+          <w:ilvl w:val="0"/>
+          <w:numId w:val="1002"/>
+        </w:numPr>
+      </w:pPr>
       <w:r>
         <w:rPr>
           <w:b/>
           <w:bCs/>
         </w:rPr>
+        <w:t xml:space="preserve">Earlier in tenure:</w:t>
+      </w:r>
+      <w:r>
+        <w:t xml:space="preserve"> </w:t>
+      </w:r>
+      <w:r>
+        <w:t xml:space="preserve">Led a team-of-teams of</w:t>
+      </w:r>
+      <w:r>
+        <w:t xml:space="preserve"> </w:t>
+      </w:r>
+      <w:r>
+        <w:rPr>
+          <w:b/>
+          <w:bCs/>
+        </w:rPr>
         <w:t xml:space="preserve">40+</w:t>
       </w:r>
       <w:r>
@@ -256,7 +350,7 @@
         <w:pStyle w:val="Compact"/>
         <w:numPr>
           <w:ilvl w:val="0"/>
-          <w:numId w:val="1003"/>
+          <w:numId w:val="1004"/>
         </w:numPr>
       </w:pPr>
       <w:r>
@@ -268,7 +362,7 @@
         <w:pStyle w:val="Compact"/>
         <w:numPr>
           <w:ilvl w:val="0"/>
-          <w:numId w:val="1003"/>
+          <w:numId w:val="1004"/>
         </w:numPr>
       </w:pPr>
       <w:r>
@@ -280,7 +374,7 @@
         <w:pStyle w:val="Compact"/>
         <w:numPr>
           <w:ilvl w:val="0"/>
-          <w:numId w:val="1003"/>
+          <w:numId w:val="1004"/>
         </w:numPr>
       </w:pPr>
       <w:r>
@@ -324,7 +418,7 @@
         <w:pStyle w:val="Compact"/>
         <w:numPr>
           <w:ilvl w:val="0"/>
-          <w:numId w:val="1004"/>
+          <w:numId w:val="1005"/>
         </w:numPr>
       </w:pPr>
       <w:r>
@@ -336,7 +430,7 @@
         <w:pStyle w:val="Compact"/>
         <w:numPr>
           <w:ilvl w:val="0"/>
-          <w:numId w:val="1004"/>
+          <w:numId w:val="1005"/>
         </w:numPr>
       </w:pPr>
       <w:r>
@@ -370,7 +464,7 @@
         <w:pStyle w:val="Compact"/>
         <w:numPr>
           <w:ilvl w:val="0"/>
-          <w:numId w:val="1005"/>
+          <w:numId w:val="1006"/>
         </w:numPr>
       </w:pPr>
       <w:r>
@@ -404,7 +498,7 @@
         <w:pStyle w:val="Compact"/>
         <w:numPr>
           <w:ilvl w:val="0"/>
-          <w:numId w:val="1006"/>
+          <w:numId w:val="1007"/>
         </w:numPr>
       </w:pPr>
       <w:r>
@@ -434,7 +528,7 @@
         <w:pStyle w:val="Compact"/>
         <w:numPr>
           <w:ilvl w:val="0"/>
-          <w:numId w:val="1007"/>
+          <w:numId w:val="1008"/>
         </w:numPr>
       </w:pPr>
       <w:r>
@@ -456,7 +550,7 @@
         <w:pStyle w:val="Compact"/>
         <w:numPr>
           <w:ilvl w:val="0"/>
-          <w:numId w:val="1007"/>
+          <w:numId w:val="1008"/>
         </w:numPr>
       </w:pPr>
       <w:r>
@@ -478,7 +572,7 @@
         <w:pStyle w:val="Compact"/>
         <w:numPr>
           <w:ilvl w:val="0"/>
-          <w:numId w:val="1007"/>
+          <w:numId w:val="1008"/>
         </w:numPr>
       </w:pPr>
       <w:r>
@@ -517,7 +611,7 @@
         <w:pStyle w:val="Compact"/>
         <w:numPr>
           <w:ilvl w:val="0"/>
-          <w:numId w:val="1008"/>
+          <w:numId w:val="1009"/>
         </w:numPr>
       </w:pPr>
       <w:r>
@@ -555,7 +649,7 @@
         <w:pStyle w:val="Compact"/>
         <w:numPr>
           <w:ilvl w:val="0"/>
-          <w:numId w:val="1008"/>
+          <w:numId w:val="1009"/>
         </w:numPr>
       </w:pPr>
       <w:r>
@@ -574,7 +668,7 @@
         <w:pStyle w:val="Compact"/>
         <w:numPr>
           <w:ilvl w:val="0"/>
-          <w:numId w:val="1008"/>
+          <w:numId w:val="1009"/>
         </w:numPr>
       </w:pPr>
       <w:r>
@@ -613,7 +707,7 @@
         <w:pStyle w:val="Compact"/>
         <w:numPr>
           <w:ilvl w:val="0"/>
-          <w:numId w:val="1009"/>
+          <w:numId w:val="1010"/>
         </w:numPr>
       </w:pPr>
       <w:r>
@@ -635,7 +729,7 @@
         <w:pStyle w:val="Compact"/>
         <w:numPr>
           <w:ilvl w:val="0"/>
-          <w:numId w:val="1009"/>
+          <w:numId w:val="1010"/>
         </w:numPr>
       </w:pPr>
       <w:r>
@@ -651,7 +745,7 @@
         <w:pStyle w:val="Compact"/>
         <w:numPr>
           <w:ilvl w:val="0"/>
-          <w:numId w:val="1009"/>
+          <w:numId w:val="1010"/>
         </w:numPr>
       </w:pPr>
       <w:r>
@@ -673,7 +767,7 @@
         <w:pStyle w:val="Compact"/>
         <w:numPr>
           <w:ilvl w:val="0"/>
-          <w:numId w:val="1009"/>
+          <w:numId w:val="1010"/>
         </w:numPr>
       </w:pPr>
       <w:r>
@@ -698,7 +792,71 @@
       </w:r>
     </w:p>
     <w:bookmarkEnd w:id="18"/>
-    <w:bookmarkStart w:id="19" w:name="core-competencies"/>
+    <w:bookmarkStart w:id="19" w:name="communities-speaking"/>
+    <w:p>
+      <w:pPr>
+        <w:pStyle w:val="Heading2"/>
+      </w:pPr>
+      <w:r>
+        <w:t xml:space="preserve">COMMUNITIES &amp; SPEAKING</w:t>
+      </w:r>
+    </w:p>
+    <w:p>
+      <w:pPr>
+        <w:pStyle w:val="Compact"/>
+        <w:numPr>
+          <w:ilvl w:val="0"/>
+          <w:numId w:val="1011"/>
+        </w:numPr>
+      </w:pPr>
+      <w:r>
+        <w:t xml:space="preserve">Active participant, contributor, and speaker in</w:t>
+      </w:r>
+      <w:r>
+        <w:t xml:space="preserve"> </w:t>
+      </w:r>
+      <w:r>
+        <w:rPr>
+          <w:b/>
+          <w:bCs/>
+        </w:rPr>
+        <w:t xml:space="preserve">software assurance</w:t>
+      </w:r>
+      <w:r>
+        <w:t xml:space="preserve">,</w:t>
+      </w:r>
+      <w:r>
+        <w:t xml:space="preserve"> </w:t>
+      </w:r>
+      <w:r>
+        <w:rPr>
+          <w:b/>
+          <w:bCs/>
+        </w:rPr>
+        <w:t xml:space="preserve">DevSecOps</w:t>
+      </w:r>
+      <w:r>
+        <w:t xml:space="preserve">, and</w:t>
+      </w:r>
+      <w:r>
+        <w:t xml:space="preserve"> </w:t>
+      </w:r>
+      <w:r>
+        <w:rPr>
+          <w:b/>
+          <w:bCs/>
+        </w:rPr>
+        <w:t xml:space="preserve">AI</w:t>
+      </w:r>
+      <w:r>
+        <w:t xml:space="preserve"> </w:t>
+      </w:r>
+      <w:r>
+        <w:t xml:space="preserve">communities of practice.</w:t>
+      </w:r>
+    </w:p>
+    <w:bookmarkEnd w:id="19"/>
+    <w:bookmarkStart w:id="20" w:name="core-competencies"/>
     <w:p>
       <w:pPr>
         <w:pStyle w:val="Heading2"/>
@@ -816,8 +974,8 @@
         <w:t xml:space="preserve">References available on request.</w:t>
       </w:r>
     </w:p>
-    <w:bookmarkEnd w:id="19"/>
     <w:bookmarkEnd w:id="20"/>
+    <w:bookmarkEnd w:id="21"/>
     <w:sectPr>
       <w:footnotePr>
         <w:numRestart w:val="eachSect"/>
@@ -1171,6 +1329,12 @@
     <w:abstractNumId w:val="991"/>
   </w:num>
   <w:num w:numId="1009">
+    <w:abstractNumId w:val="991"/>
+  </w:num>
+  <w:num w:numId="1010">
+    <w:abstractNumId w:val="991"/>
+  </w:num>
+  <w:num w:numId="1011">
     <w:abstractNumId w:val="991"/>
   </w:num>
 </w:numbering>

</xml_diff>

<commit_message>
Add technical writing + research-synthesis bullet
</commit_message>
<xml_diff>
--- a/docs/resume_v2_draft.docx
+++ b/docs/resume_v2_draft.docx
@@ -247,6 +247,28 @@
       </w:r>
       <w:r>
         <w:t xml:space="preserve">Develop and deliver courses on AI capabilities and limitations, data literacy, and automation — for internal team and customer audiences.</w:t>
+      </w:r>
+    </w:p>
+    <w:p>
+      <w:pPr>
+        <w:pStyle w:val="Compact"/>
+        <w:numPr>
+          <w:ilvl w:val="0"/>
+          <w:numId w:val="1002"/>
+        </w:numPr>
+      </w:pPr>
+      <w:r>
+        <w:rPr>
+          <w:b/>
+          <w:bCs/>
+        </w:rPr>
+        <w:t xml:space="preserve">Technical writing &amp; research synthesis:</w:t>
+      </w:r>
+      <w:r>
+        <w:t xml:space="preserve"> </w:t>
+      </w:r>
+      <w:r>
+        <w:t xml:space="preserve">Author customer-facing briefs, technical reports, and peer-reviewed papers; rapidly absorb dense technical material from cross-disciplinary sources (security, ML research, formal methods).</w:t>
       </w:r>
     </w:p>
     <w:p>

</xml_diff>

<commit_message>
Add rapid-prototyping bias, cross-platform/WSL fluency
</commit_message>
<xml_diff>
--- a/docs/resume_v2_draft.docx
+++ b/docs/resume_v2_draft.docx
@@ -44,7 +44,23 @@
         <w:pStyle w:val="FirstParagraph"/>
       </w:pPr>
       <w:r>
-        <w:t xml:space="preserve">Senior applied AI engineer with 11 years across machine learning, robotics, cybersecurity, and autonomous systems. Currently AI Subject Matter Expert for the DEVCOM AvMC Software Assurance team — designing and building AI-augmented software-assurance tooling: LLM/RAG pipelines over CWE/CVE corpora, Code Property Graph and AST-based static analysis, knowledge graphs, assurance dashboards, and federated artifact-management research. Earlier in my COLSA tenure: led a 40+ person distributed engineering organization delivering containerized ML platforms. PhD research at Purdue on operational behavior of frontier LLMs in offline / air-gapped environments.</w:t>
+        <w:t xml:space="preserve">Senior applied AI engineer with 11 years across machine learning, robotics, cybersecurity, and autonomous systems. Currently AI Subject Matter Expert for the DEVCOM AvMC Software Assurance team — designing and building AI-augmented software-assurance tooling: LLM/RAG pipelines over CWE/CVE corpora, Code Property Graph and AST-based static analysis, knowledge graphs, assurance dashboards, and federated artifact-management research.</w:t>
+      </w:r>
+      <w:r>
+        <w:t xml:space="preserve"> </w:t>
+      </w:r>
+      <w:r>
+        <w:rPr>
+          <w:b/>
+          <w:bCs/>
+        </w:rPr>
+        <w:t xml:space="preserve">Rapid-prototyping bias</w:t>
+      </w:r>
+      <w:r>
+        <w:t xml:space="preserve"> </w:t>
+      </w:r>
+      <w:r>
+        <w:t xml:space="preserve">— favor shipping working systems fast over exhaustive up-front design. Earlier in my COLSA tenure: led a 40+ person distributed engineering organization delivering containerized ML platforms. PhD research at Purdue on operational behavior of frontier LLMs in offline / air-gapped environments.</w:t>
       </w:r>
       <w:r>
         <w:t xml:space="preserve"> </w:t>
@@ -974,7 +990,7 @@
         <w:t xml:space="preserve"> </w:t>
       </w:r>
       <w:r>
-        <w:t xml:space="preserve">Python (primary), TensorFlow, Git/GitLab/GitHub.</w:t>
+        <w:t xml:space="preserve">Python (primary), TensorFlow, Git/GitLab/GitHub. Cross-platform fluent: Linux, Windows, and WSL2 development environments.</w:t>
       </w:r>
     </w:p>
     <w:p>

</xml_diff>

<commit_message>
Rewrite in user voice, no em dashes; simplify projects to coming-soon list; remove GitHub link
</commit_message>
<xml_diff>
--- a/docs/resume_v2_draft.docx
+++ b/docs/resume_v2_draft.docx
@@ -44,93 +44,83 @@
         <w:pStyle w:val="FirstParagraph"/>
       </w:pPr>
       <w:r>
-        <w:t xml:space="preserve">Senior applied AI engineer with 11 years across machine learning, robotics, cybersecurity, and autonomous systems. Currently AI Subject Matter Expert for the DEVCOM AvMC Software Assurance team — designing and building AI-augmented software-assurance tooling: LLM/RAG pipelines over CWE/CVE corpora, Code Property Graph and AST-based static analysis, knowledge graphs, assurance dashboards, and federated artifact-management research.</w:t>
-      </w:r>
-      <w:r>
-        <w:t xml:space="preserve"> </w:t>
-      </w:r>
+        <w:t xml:space="preserve">Senior applied AI engineer. 11 years building things that have to actually work in production. ML, robotics, cybersecurity, autonomous systems.</w:t>
+      </w:r>
+    </w:p>
+    <w:p>
+      <w:pPr>
+        <w:pStyle w:val="BodyText"/>
+      </w:pPr>
+      <w:r>
+        <w:t xml:space="preserve">I’m currently the AI SME for the DEVCOM AvMC Software Assurance team. Day to day, I design and build AI-augmented tooling for Army aviation and missile software assurance. That means LLM and RAG pipelines over CWE and CVE corpora, Code Property Graph (CPG) and AST-based static analysis, knowledge graphs, assurance dashboards, federated artifact-management research, and the papers and briefs that come out of all that.</w:t>
+      </w:r>
+    </w:p>
+    <w:p>
+      <w:pPr>
+        <w:pStyle w:val="BodyText"/>
+      </w:pPr>
+      <w:r>
+        <w:t xml:space="preserve">I prototype fast. Working systems first, polish later. PhD work at Purdue digs into what happens to frontier LLMs once you take them offline.</w:t>
+      </w:r>
+    </w:p>
+    <w:p>
+      <w:pPr>
+        <w:pStyle w:val="BodyText"/>
+      </w:pPr>
+      <w:r>
+        <w:t xml:space="preserve">CISSP. Active TS/SCI. B.S. in Information Assurance. The combination of AI depth and real security credentials isn’t common.</w:t>
+      </w:r>
+    </w:p>
+    <w:p>
+      <w:r>
+        <w:pict>
+          <v:rect style="width:0;height:1.5pt" o:hralign="center" o:hrstd="t" o:hr="t"/>
+        </w:pict>
+      </w:r>
+    </w:p>
+    <w:bookmarkEnd w:id="9"/>
+    <w:bookmarkStart w:id="15" w:name="experience"/>
+    <w:p>
+      <w:pPr>
+        <w:pStyle w:val="Heading2"/>
+      </w:pPr>
+      <w:r>
+        <w:t xml:space="preserve">EXPERIENCE</w:t>
+      </w:r>
+    </w:p>
+    <w:bookmarkStart w:id="10" w:name="X5cef0ffd4688191fa0a8e30cffe01224fba1fbd"/>
+    <w:p>
+      <w:pPr>
+        <w:pStyle w:val="Heading3"/>
+      </w:pPr>
+      <w:r>
+        <w:t xml:space="preserve">Senior Data Scientist &amp; Technical Lead, COLSA</w:t>
+      </w:r>
+    </w:p>
+    <w:p>
+      <w:pPr>
+        <w:pStyle w:val="FirstParagraph"/>
+      </w:pPr>
+      <w:r>
+        <w:t xml:space="preserve">Jun 2021 to present. Huntsville, AL.</w:t>
+      </w:r>
+    </w:p>
+    <w:p>
+      <w:pPr>
+        <w:pStyle w:val="BodyText"/>
+      </w:pPr>
       <w:r>
         <w:rPr>
           <w:b/>
           <w:bCs/>
         </w:rPr>
-        <w:t xml:space="preserve">Rapid-prototyping bias</w:t>
+        <w:t xml:space="preserve">Current role.</w:t>
       </w:r>
       <w:r>
         <w:t xml:space="preserve"> </w:t>
       </w:r>
       <w:r>
-        <w:t xml:space="preserve">— favor shipping working systems fast over exhaustive up-front design. Earlier in my COLSA tenure: led a 40+ person distributed engineering organization delivering containerized ML platforms. PhD research at Purdue on operational behavior of frontier LLMs in offline / air-gapped environments.</w:t>
-      </w:r>
-      <w:r>
-        <w:t xml:space="preserve"> </w:t>
-      </w:r>
-      <w:r>
-        <w:rPr>
-          <w:b/>
-          <w:bCs/>
-        </w:rPr>
-        <w:t xml:space="preserve">CISSP</w:t>
-      </w:r>
-      <w:r>
-        <w:t xml:space="preserve"> </w:t>
-      </w:r>
-      <w:r>
-        <w:t xml:space="preserve">holder with</w:t>
-      </w:r>
-      <w:r>
-        <w:t xml:space="preserve"> </w:t>
-      </w:r>
-      <w:r>
-        <w:rPr>
-          <w:b/>
-          <w:bCs/>
-        </w:rPr>
-        <w:t xml:space="preserve">active TS/SCI</w:t>
-      </w:r>
-      <w:r>
-        <w:t xml:space="preserve"> </w:t>
-      </w:r>
-      <w:r>
-        <w:t xml:space="preserve">and B.S. in Information Assurance — applied AI with real security depth.</w:t>
-      </w:r>
-    </w:p>
-    <w:p>
-      <w:r>
-        <w:pict>
-          <v:rect style="width:0;height:1.5pt" o:hralign="center" o:hrstd="t" o:hr="t"/>
-        </w:pict>
-      </w:r>
-    </w:p>
-    <w:bookmarkEnd w:id="9"/>
-    <w:bookmarkStart w:id="15" w:name="experience"/>
-    <w:p>
-      <w:pPr>
-        <w:pStyle w:val="Heading2"/>
-      </w:pPr>
-      <w:r>
-        <w:t xml:space="preserve">EXPERIENCE</w:t>
-      </w:r>
-    </w:p>
-    <w:bookmarkStart w:id="10" w:name="X5cef0ffd4688191fa0a8e30cffe01224fba1fbd"/>
-    <w:p>
-      <w:pPr>
-        <w:pStyle w:val="Heading3"/>
-      </w:pPr>
-      <w:r>
-        <w:t xml:space="preserve">Senior Data Scientist &amp; Technical Lead — COLSA</w:t>
-      </w:r>
-    </w:p>
-    <w:p>
-      <w:pPr>
-        <w:pStyle w:val="FirstParagraph"/>
-      </w:pPr>
-      <w:r>
-        <w:rPr>
-          <w:i/>
-          <w:iCs/>
-        </w:rPr>
-        <w:t xml:space="preserve">Jun 2021 – Present · Huntsville, AL</w:t>
+        <w:t xml:space="preserve">AI Subject Matter Expert for the DEVCOM AvMC Software Assurance team. I design and build AI-augmented tooling for U.S. Army aviation and missile software-assurance programs. The active build surface looks like:</w:t>
       </w:r>
     </w:p>
     <w:p>
@@ -142,105 +132,7 @@
         </w:numPr>
       </w:pPr>
       <w:r>
-        <w:rPr>
-          <w:b/>
-          <w:bCs/>
-        </w:rPr>
-        <w:t xml:space="preserve">Current:</w:t>
-      </w:r>
-      <w:r>
-        <w:t xml:space="preserve"> </w:t>
-      </w:r>
-      <w:r>
-        <w:t xml:space="preserve">AI Subject Matter Expert for the</w:t>
-      </w:r>
-      <w:r>
-        <w:t xml:space="preserve"> </w:t>
-      </w:r>
-      <w:r>
-        <w:rPr>
-          <w:b/>
-          <w:bCs/>
-        </w:rPr>
-        <w:t xml:space="preserve">DEVCOM AvMC Software Assurance</w:t>
-      </w:r>
-      <w:r>
-        <w:t xml:space="preserve"> </w:t>
-      </w:r>
-      <w:r>
-        <w:t xml:space="preserve">team. Design and build AI-augmented software-assurance tooling for U.S. Army aviation and missile programs across:</w:t>
-      </w:r>
-    </w:p>
-    <w:p>
-      <w:pPr>
-        <w:pStyle w:val="Compact"/>
-        <w:numPr>
-          <w:ilvl w:val="1"/>
-          <w:numId w:val="1003"/>
-        </w:numPr>
-      </w:pPr>
-      <w:r>
-        <w:t xml:space="preserve">LLM + RAG pipelines over CWE / CVE / software-assurance reference corpora</w:t>
-      </w:r>
-    </w:p>
-    <w:p>
-      <w:pPr>
-        <w:pStyle w:val="Compact"/>
-        <w:numPr>
-          <w:ilvl w:val="1"/>
-          <w:numId w:val="1003"/>
-        </w:numPr>
-      </w:pPr>
-      <w:r>
-        <w:t xml:space="preserve">Code Property Graph (CPG) and AST-based static-analysis tooling</w:t>
-      </w:r>
-    </w:p>
-    <w:p>
-      <w:pPr>
-        <w:pStyle w:val="Compact"/>
-        <w:numPr>
-          <w:ilvl w:val="1"/>
-          <w:numId w:val="1003"/>
-        </w:numPr>
-      </w:pPr>
-      <w:r>
-        <w:t xml:space="preserve">Knowledge graphs for cross-artifact relationships</w:t>
-      </w:r>
-    </w:p>
-    <w:p>
-      <w:pPr>
-        <w:pStyle w:val="Compact"/>
-        <w:numPr>
-          <w:ilvl w:val="1"/>
-          <w:numId w:val="1003"/>
-        </w:numPr>
-      </w:pPr>
-      <w:r>
-        <w:t xml:space="preserve">Assurance dashboards + automated repository management</w:t>
-      </w:r>
-    </w:p>
-    <w:p>
-      <w:pPr>
-        <w:pStyle w:val="Compact"/>
-        <w:numPr>
-          <w:ilvl w:val="1"/>
-          <w:numId w:val="1003"/>
-        </w:numPr>
-      </w:pPr>
-      <w:r>
-        <w:t xml:space="preserve">Federated software-assurance artifacts management (research-level)</w:t>
-      </w:r>
-    </w:p>
-    <w:p>
-      <w:pPr>
-        <w:pStyle w:val="Compact"/>
-        <w:numPr>
-          <w:ilvl w:val="1"/>
-          <w:numId w:val="1003"/>
-        </w:numPr>
-      </w:pPr>
-      <w:r>
-        <w:t xml:space="preserve">Technical paper authorship on federated artifact management and related topics</w:t>
+        <w:t xml:space="preserve">LLM and RAG pipelines over CWE, CVE, and software-assurance reference corpora</w:t>
       </w:r>
     </w:p>
     <w:p>
@@ -252,17 +144,7 @@
         </w:numPr>
       </w:pPr>
       <w:r>
-        <w:rPr>
-          <w:b/>
-          <w:bCs/>
-        </w:rPr>
-        <w:t xml:space="preserve">Teaching:</w:t>
-      </w:r>
-      <w:r>
-        <w:t xml:space="preserve"> </w:t>
-      </w:r>
-      <w:r>
-        <w:t xml:space="preserve">Develop and deliver courses on AI capabilities and limitations, data literacy, and automation — for internal team and customer audiences.</w:t>
+        <w:t xml:space="preserve">Code Property Graph (CPG) and AST-based static-analysis tooling</w:t>
       </w:r>
     </w:p>
     <w:p>
@@ -274,17 +156,7 @@
         </w:numPr>
       </w:pPr>
       <w:r>
-        <w:rPr>
-          <w:b/>
-          <w:bCs/>
-        </w:rPr>
-        <w:t xml:space="preserve">Technical writing &amp; research synthesis:</w:t>
-      </w:r>
-      <w:r>
-        <w:t xml:space="preserve"> </w:t>
-      </w:r>
-      <w:r>
-        <w:t xml:space="preserve">Author customer-facing briefs, technical reports, and peer-reviewed papers; rapidly absorb dense technical material from cross-disciplinary sources (security, ML research, formal methods).</w:t>
+        <w:t xml:space="preserve">Knowledge graphs for cross-artifact relationships</w:t>
       </w:r>
     </w:p>
     <w:p>
@@ -296,33 +168,7 @@
         </w:numPr>
       </w:pPr>
       <w:r>
-        <w:rPr>
-          <w:b/>
-          <w:bCs/>
-        </w:rPr>
-        <w:t xml:space="preserve">Earlier in tenure:</w:t>
-      </w:r>
-      <w:r>
-        <w:t xml:space="preserve"> </w:t>
-      </w:r>
-      <w:r>
-        <w:t xml:space="preserve">Led a team-of-teams of</w:t>
-      </w:r>
-      <w:r>
-        <w:t xml:space="preserve"> </w:t>
-      </w:r>
-      <w:r>
-        <w:rPr>
-          <w:b/>
-          <w:bCs/>
-        </w:rPr>
-        <w:t xml:space="preserve">40+</w:t>
-      </w:r>
-      <w:r>
-        <w:t xml:space="preserve"> </w:t>
-      </w:r>
-      <w:r>
-        <w:t xml:space="preserve">distributed multidisciplinary STEM SMEs delivering containerized ML platforms — real-time signal characterization, anomaly detection, and geolocation across high-throughput RF data streams. Scaled Agile CI/CD MLOps in compliance-bounded environments.</w:t>
+        <w:t xml:space="preserve">Assurance dashboards and automated repo management</w:t>
       </w:r>
     </w:p>
     <w:p>
@@ -334,7 +180,7 @@
         </w:numPr>
       </w:pPr>
       <w:r>
-        <w:t xml:space="preserve">Designed and operated team development + production infrastructure end-to-end across both phases: hybrid cloud architecture, on-prem hardware, data pipelines, container orchestration.</w:t>
+        <w:t xml:space="preserve">Federated software-assurance artifacts management (research stage)</w:t>
       </w:r>
     </w:p>
     <w:p>
@@ -346,7 +192,95 @@
         </w:numPr>
       </w:pPr>
       <w:r>
-        <w:t xml:space="preserve">Recruited, hired, mentored, and led technical staff during the leadership phase; drove growth of the Data Science Division.</w:t>
+        <w:t xml:space="preserve">Technical papers on federated artifact management and related topics</w:t>
+      </w:r>
+    </w:p>
+    <w:p>
+      <w:pPr>
+        <w:pStyle w:val="FirstParagraph"/>
+      </w:pPr>
+      <w:r>
+        <w:rPr>
+          <w:b/>
+          <w:bCs/>
+        </w:rPr>
+        <w:t xml:space="preserve">Teaching.</w:t>
+      </w:r>
+      <w:r>
+        <w:t xml:space="preserve"> </w:t>
+      </w:r>
+      <w:r>
+        <w:t xml:space="preserve">I develop and deliver courses on AI capabilities and limitations, data literacy, and automation. Internal team and customer audiences.</w:t>
+      </w:r>
+    </w:p>
+    <w:p>
+      <w:pPr>
+        <w:pStyle w:val="BodyText"/>
+      </w:pPr>
+      <w:r>
+        <w:rPr>
+          <w:b/>
+          <w:bCs/>
+        </w:rPr>
+        <w:t xml:space="preserve">Technical writing.</w:t>
+      </w:r>
+      <w:r>
+        <w:t xml:space="preserve"> </w:t>
+      </w:r>
+      <w:r>
+        <w:t xml:space="preserve">Customer briefs, technical reports, and peer-reviewed papers. I read dense material from security research, ML research, and formal methods, then translate it for working engineers.</w:t>
+      </w:r>
+    </w:p>
+    <w:p>
+      <w:pPr>
+        <w:pStyle w:val="BodyText"/>
+      </w:pPr>
+      <w:r>
+        <w:rPr>
+          <w:b/>
+          <w:bCs/>
+        </w:rPr>
+        <w:t xml:space="preserve">Earlier in this role.</w:t>
+      </w:r>
+      <w:r>
+        <w:t xml:space="preserve"> </w:t>
+      </w:r>
+      <w:r>
+        <w:t xml:space="preserve">I led a team-of-teams of 40+ distributed multidisciplinary STEM SMEs delivering containerized ML platforms. Real-time signal characterization, anomaly detection, and geolocation on high-throughput RF data streams. Scaled Agile CI/CD MLOps in compliance-bounded environments.</w:t>
+      </w:r>
+    </w:p>
+    <w:p>
+      <w:pPr>
+        <w:pStyle w:val="BodyText"/>
+      </w:pPr>
+      <w:r>
+        <w:t xml:space="preserve">Across both phases I owned the team’s development and production infrastructure end to end. Hybrid cloud architecture, on-prem hardware, data pipelines, container orchestration.</w:t>
+      </w:r>
+    </w:p>
+    <w:p>
+      <w:pPr>
+        <w:pStyle w:val="BodyText"/>
+      </w:pPr>
+      <w:r>
+        <w:t xml:space="preserve">During the leadership phase I recruited, hired, mentored, and supervised technical staff. Drove growth of the Data Science Division. Customer-facing throughout the tenure with stakeholder presentations, monthly status reports, and scoping work across concurrent Army programs.</w:t>
+      </w:r>
+    </w:p>
+    <w:bookmarkEnd w:id="10"/>
+    <w:bookmarkStart w:id="11" w:name="ai-systems-engineer-dynetics"/>
+    <w:p>
+      <w:pPr>
+        <w:pStyle w:val="Heading3"/>
+      </w:pPr>
+      <w:r>
+        <w:t xml:space="preserve">AI Systems Engineer, Dynetics</w:t>
+      </w:r>
+    </w:p>
+    <w:p>
+      <w:pPr>
+        <w:pStyle w:val="FirstParagraph"/>
+      </w:pPr>
+      <w:r>
+        <w:t xml:space="preserve">May 2018 to Jun 2021. Huntsville, AL.</w:t>
       </w:r>
     </w:p>
     <w:p>
@@ -354,21 +288,45 @@
         <w:pStyle w:val="Compact"/>
         <w:numPr>
           <w:ilvl w:val="0"/>
-          <w:numId w:val="1002"/>
+          <w:numId w:val="1003"/>
         </w:numPr>
       </w:pPr>
       <w:r>
-        <w:t xml:space="preserve">Customer-facing throughout — stakeholder presentations, monthly status reports, scoping + negotiation across concurrent Army programs.</w:t>
-      </w:r>
-    </w:p>
-    <w:bookmarkEnd w:id="10"/>
-    <w:bookmarkStart w:id="11" w:name="ai-systems-engineer-dynetics"/>
+        <w:t xml:space="preserve">Built autonomous multi-agent AI systems for resource allocation and coordination of UAV swarms operating in disconnected and offline environments.</w:t>
+      </w:r>
+    </w:p>
+    <w:p>
+      <w:pPr>
+        <w:pStyle w:val="Compact"/>
+        <w:numPr>
+          <w:ilvl w:val="0"/>
+          <w:numId w:val="1003"/>
+        </w:numPr>
+      </w:pPr>
+      <w:r>
+        <w:t xml:space="preserve">Technical authority of the AI working group. Led software customization of collaborative-agent resource management platforms.</w:t>
+      </w:r>
+    </w:p>
+    <w:p>
+      <w:pPr>
+        <w:pStyle w:val="Compact"/>
+        <w:numPr>
+          <w:ilvl w:val="0"/>
+          <w:numId w:val="1003"/>
+        </w:numPr>
+      </w:pPr>
+      <w:r>
+        <w:t xml:space="preserve">Rapid-prototyped command-and-control capabilities under tight deadlines.</w:t>
+      </w:r>
+    </w:p>
+    <w:bookmarkEnd w:id="11"/>
+    <w:bookmarkStart w:id="12" w:name="X94ef793499242cb062d2d33474d7cbd5fb18f20"/>
     <w:p>
       <w:pPr>
         <w:pStyle w:val="Heading3"/>
       </w:pPr>
       <w:r>
-        <w:t xml:space="preserve">AI Systems Engineer — Dynetics</w:t>
+        <w:t xml:space="preserve">Robotics Engineer, CCDC Ground Vehicle Systems Center (formerly TARDEC)</w:t>
       </w:r>
     </w:p>
     <w:p>
@@ -376,11 +334,7 @@
         <w:pStyle w:val="FirstParagraph"/>
       </w:pPr>
       <w:r>
-        <w:rPr>
-          <w:i/>
-          <w:iCs/>
-        </w:rPr>
-        <w:t xml:space="preserve">May 2018 – Jun 2021 · Huntsville, AL</w:t>
+        <w:t xml:space="preserve">Sep 2015 to May 2018. Warren, MI.</w:t>
       </w:r>
     </w:p>
     <w:p>
@@ -392,7 +346,7 @@
         </w:numPr>
       </w:pPr>
       <w:r>
-        <w:t xml:space="preserve">Built autonomous multi-agent AI systems for resource allocation and coordination of unmanned aerial vehicle swarms operating in disconnected / offline environments.</w:t>
+        <w:t xml:space="preserve">Real-time control software and sensor integration for autonomous ground systems.</w:t>
       </w:r>
     </w:p>
     <w:p>
@@ -404,39 +358,17 @@
         </w:numPr>
       </w:pPr>
       <w:r>
-        <w:t xml:space="preserve">Technical authority of the AI working group; led software customization of collaborative-agent resource management platforms.</w:t>
-      </w:r>
-    </w:p>
-    <w:p>
-      <w:pPr>
-        <w:pStyle w:val="Compact"/>
-        <w:numPr>
-          <w:ilvl w:val="0"/>
-          <w:numId w:val="1004"/>
-        </w:numPr>
-      </w:pPr>
-      <w:r>
-        <w:t xml:space="preserve">Rapid-prototyped command-and-control capabilities under tight deadlines; research-to-deployment cycles.</w:t>
-      </w:r>
-    </w:p>
-    <w:bookmarkEnd w:id="11"/>
-    <w:bookmarkStart w:id="12" w:name="X94ef793499242cb062d2d33474d7cbd5fb18f20"/>
+        <w:t xml:space="preserve">Hardware-in-the-loop testing, embedded development, sensor fusion.</w:t>
+      </w:r>
+    </w:p>
+    <w:bookmarkEnd w:id="12"/>
+    <w:bookmarkStart w:id="13" w:name="computer-scientist-ncar"/>
     <w:p>
       <w:pPr>
         <w:pStyle w:val="Heading3"/>
       </w:pPr>
       <w:r>
-        <w:t xml:space="preserve">Robotics Engineer — CCDC Ground Vehicle Systems Center</w:t>
-      </w:r>
-      <w:r>
-        <w:t xml:space="preserve"> </w:t>
-      </w:r>
-      <w:r>
-        <w:rPr>
-          <w:i/>
-          <w:iCs/>
-        </w:rPr>
-        <w:t xml:space="preserve">(formerly TARDEC)</w:t>
+        <w:t xml:space="preserve">Computer Scientist, NCAR</w:t>
       </w:r>
     </w:p>
     <w:p>
@@ -444,11 +376,7 @@
         <w:pStyle w:val="FirstParagraph"/>
       </w:pPr>
       <w:r>
-        <w:rPr>
-          <w:i/>
-          <w:iCs/>
-        </w:rPr>
-        <w:t xml:space="preserve">Sep 2015 – May 2018 · Warren, MI</w:t>
+        <w:t xml:space="preserve">May 2015 to Aug 2015. Boulder, CO.</w:t>
       </w:r>
     </w:p>
     <w:p>
@@ -460,29 +388,17 @@
         </w:numPr>
       </w:pPr>
       <w:r>
-        <w:t xml:space="preserve">Engineered real-time control software and sensor integration for autonomous ground systems; supported mission-critical demonstrations across multiple platforms.</w:t>
-      </w:r>
-    </w:p>
-    <w:p>
-      <w:pPr>
-        <w:pStyle w:val="Compact"/>
-        <w:numPr>
-          <w:ilvl w:val="0"/>
-          <w:numId w:val="1005"/>
-        </w:numPr>
-      </w:pPr>
-      <w:r>
-        <w:t xml:space="preserve">Hardware-in-the-loop testing, embedded development, sensor fusion.</w:t>
-      </w:r>
-    </w:p>
-    <w:bookmarkEnd w:id="12"/>
-    <w:bookmarkStart w:id="13" w:name="X1672119e7df322b705a5814f4a3970e4d290b3c"/>
+        <w:t xml:space="preserve">Built a distributed environmental-sensor network on a Raspberry Pi cluster with web-accessible data collection. Did experimentation on the CISL supercomputer.</w:t>
+      </w:r>
+    </w:p>
+    <w:bookmarkEnd w:id="13"/>
+    <w:bookmarkStart w:id="14" w:name="X257c2a20193f25ffd7872bce03c726bfcd35b67"/>
     <w:p>
       <w:pPr>
         <w:pStyle w:val="Heading3"/>
       </w:pPr>
       <w:r>
-        <w:t xml:space="preserve">Computer Scientist — National Center for Atmospheric Research (NCAR)</w:t>
+        <w:t xml:space="preserve">Big Data Infrastructure Developer, Jacksonville State University</w:t>
       </w:r>
     </w:p>
     <w:p>
@@ -490,11 +406,7 @@
         <w:pStyle w:val="FirstParagraph"/>
       </w:pPr>
       <w:r>
-        <w:rPr>
-          <w:i/>
-          <w:iCs/>
-        </w:rPr>
-        <w:t xml:space="preserve">May 2015 – Aug 2015 · Boulder, CO</w:t>
+        <w:t xml:space="preserve">Jan 2014 to May 2015. Jacksonville, AL.</w:t>
       </w:r>
     </w:p>
     <w:p>
@@ -506,29 +418,25 @@
         </w:numPr>
       </w:pPr>
       <w:r>
-        <w:t xml:space="preserve">Built and demonstrated a distributed environmental-sensor network (Raspberry Pi cluster) with web-accessible data collection and analysis; CISL supercomputer experimentation.</w:t>
-      </w:r>
-    </w:p>
-    <w:bookmarkEnd w:id="13"/>
-    <w:bookmarkStart w:id="14" w:name="X257c2a20193f25ffd7872bce03c726bfcd35b67"/>
-    <w:p>
-      <w:pPr>
-        <w:pStyle w:val="Heading3"/>
-      </w:pPr>
-      <w:r>
-        <w:t xml:space="preserve">Big Data Infrastructure Developer — Jacksonville State University</w:t>
-      </w:r>
-    </w:p>
-    <w:p>
-      <w:pPr>
-        <w:pStyle w:val="FirstParagraph"/>
-      </w:pPr>
-      <w:r>
-        <w:rPr>
-          <w:i/>
-          <w:iCs/>
-        </w:rPr>
-        <w:t xml:space="preserve">Jan 2014 – May 2015 · Jacksonville, AL</w:t>
+        <w:t xml:space="preserve">Stood up and tuned Hadoop clusters for computational laboratory research. Documented general data-ingestion pipelines for staff and students.</w:t>
+      </w:r>
+    </w:p>
+    <w:p>
+      <w:r>
+        <w:pict>
+          <v:rect style="width:0;height:1.5pt" o:hralign="center" o:hrstd="t" o:hr="t"/>
+        </w:pict>
+      </w:r>
+    </w:p>
+    <w:bookmarkEnd w:id="14"/>
+    <w:bookmarkEnd w:id="15"/>
+    <w:bookmarkStart w:id="16" w:name="selected-projects"/>
+    <w:p>
+      <w:pPr>
+        <w:pStyle w:val="Heading2"/>
+      </w:pPr>
+      <w:r>
+        <w:t xml:space="preserve">SELECTED PROJECTS</w:t>
       </w:r>
     </w:p>
     <w:p>
@@ -540,7 +448,61 @@
         </w:numPr>
       </w:pPr>
       <w:r>
-        <w:t xml:space="preserve">Constructed and optimized Hadoop clusters for computational laboratory research; documented generalized data-ingestion pipelines for staff and student use.</w:t>
+        <w:rPr>
+          <w:b/>
+          <w:bCs/>
+        </w:rPr>
+        <w:t xml:space="preserve">apld-edge.</w:t>
+      </w:r>
+      <w:r>
+        <w:t xml:space="preserve"> </w:t>
+      </w:r>
+      <w:r>
+        <w:t xml:space="preserve">Personal algorithmic trading platform. Sqlite-backed market-data daemon running 24/7, Claude-driven signal scoring, append-only decision log. End to end. Runs locally and on AWS.</w:t>
+      </w:r>
+    </w:p>
+    <w:p>
+      <w:pPr>
+        <w:pStyle w:val="Compact"/>
+        <w:numPr>
+          <w:ilvl w:val="0"/>
+          <w:numId w:val="1007"/>
+        </w:numPr>
+      </w:pPr>
+      <w:r>
+        <w:rPr>
+          <w:b/>
+          <w:bCs/>
+        </w:rPr>
+        <w:t xml:space="preserve">DefectDojo contributions (dojo-n-speed).</w:t>
+      </w:r>
+      <w:r>
+        <w:t xml:space="preserve"> </w:t>
+      </w:r>
+      <w:r>
+        <w:t xml:space="preserve">LLM-augmented features in production AppSec tooling. Multi-SCM abstraction across GitHub, Gitea, Bitbucket, Azure DevOps. VS Code integration via URL handlers. Governance-aware infrastructure including commit-history anonymization for compliance.</w:t>
+      </w:r>
+    </w:p>
+    <w:p>
+      <w:pPr>
+        <w:pStyle w:val="Compact"/>
+        <w:numPr>
+          <w:ilvl w:val="0"/>
+          <w:numId w:val="1007"/>
+        </w:numPr>
+      </w:pPr>
+      <w:r>
+        <w:rPr>
+          <w:b/>
+          <w:bCs/>
+        </w:rPr>
+        <w:t xml:space="preserve">flip-edge.</w:t>
+      </w:r>
+      <w:r>
+        <w:t xml:space="preserve"> </w:t>
+      </w:r>
+      <w:r>
+        <w:t xml:space="preserve">Vision-driven marketplace valuation tool. Claude Vision API plus Playwright for browser automation. Screenshot to extracted listing to comp pricing.</w:t>
       </w:r>
     </w:p>
     <w:p>
@@ -550,15 +512,14 @@
         </w:pict>
       </w:r>
     </w:p>
-    <w:bookmarkEnd w:id="14"/>
-    <w:bookmarkEnd w:id="15"/>
-    <w:bookmarkStart w:id="16" w:name="selected-projects"/>
+    <w:bookmarkEnd w:id="16"/>
+    <w:bookmarkStart w:id="17" w:name="education"/>
     <w:p>
       <w:pPr>
         <w:pStyle w:val="Heading2"/>
       </w:pPr>
       <w:r>
-        <w:t xml:space="preserve">SELECTED PROJECTS</w:t>
+        <w:t xml:space="preserve">EDUCATION</w:t>
       </w:r>
     </w:p>
     <w:p>
@@ -574,13 +535,26 @@
           <w:b/>
           <w:bCs/>
         </w:rPr>
-        <w:t xml:space="preserve">apld-edge</w:t>
+        <w:t xml:space="preserve">Doctor of Technology, Interdisciplinary.</w:t>
       </w:r>
       <w:r>
         <w:t xml:space="preserve"> </w:t>
       </w:r>
       <w:r>
-        <w:t xml:space="preserve">— Personal algorithmic trading platform: sqlite-backed 24/7 market-data collection daemon + Claude-driven signal scoring + append-only decision log. Production-grade end-to-end, deployed across local + cloud infrastructure.</w:t>
+        <w:t xml:space="preserve">Purdue University. Target completion around May 2027. Dissertation:</w:t>
+      </w:r>
+      <w:r>
+        <w:t xml:space="preserve"> </w:t>
+      </w:r>
+      <w:r>
+        <w:rPr>
+          <w:i/>
+          <w:iCs/>
+        </w:rPr>
+        <w:t xml:space="preserve">Operational Divergence in Air-Gapped LLMs</w:t>
+      </w:r>
+      <w:r>
+        <w:t xml:space="preserve">. Prelim Spring 2027.</w:t>
       </w:r>
     </w:p>
     <w:p>
@@ -596,13 +570,13 @@
           <w:b/>
           <w:bCs/>
         </w:rPr>
-        <w:t xml:space="preserve">DefectDojo contributions (dojo-n-speed)</w:t>
+        <w:t xml:space="preserve">M.S. Computer Science (ML), Computational Perception &amp; Robotics.</w:t>
       </w:r>
       <w:r>
         <w:t xml:space="preserve"> </w:t>
       </w:r>
       <w:r>
-        <w:t xml:space="preserve">— LLM-augmented features in production AppSec tooling: multi-SCM abstraction (GitHub / Gitea / Bitbucket / Azure DevOps), VS Code integration via URL handlers, governance-aware infrastructure (commit-history anonymization for compliance).</w:t>
+        <w:t xml:space="preserve">Georgia Institute of Technology. May 2022.</w:t>
       </w:r>
     </w:p>
     <w:p>
@@ -618,13 +592,13 @@
           <w:b/>
           <w:bCs/>
         </w:rPr>
-        <w:t xml:space="preserve">flip-edge</w:t>
+        <w:t xml:space="preserve">B.S. Computer Science, Information Assurance.</w:t>
       </w:r>
       <w:r>
         <w:t xml:space="preserve"> </w:t>
       </w:r>
       <w:r>
-        <w:t xml:space="preserve">— Vision-driven marketplace valuation tool: Claude Vision API + Playwright browser automation for screenshot → extracted listing → comp-pricing pipeline.</w:t>
+        <w:t xml:space="preserve">Jacksonville State University. May 2015.</w:t>
       </w:r>
     </w:p>
     <w:p>
@@ -634,14 +608,14 @@
         </w:pict>
       </w:r>
     </w:p>
-    <w:bookmarkEnd w:id="16"/>
-    <w:bookmarkStart w:id="17" w:name="education"/>
+    <w:bookmarkEnd w:id="17"/>
+    <w:bookmarkStart w:id="18" w:name="credentials"/>
     <w:p>
       <w:pPr>
         <w:pStyle w:val="Heading2"/>
       </w:pPr>
       <w:r>
-        <w:t xml:space="preserve">EDUCATION</w:t>
+        <w:t xml:space="preserve">CREDENTIALS</w:t>
       </w:r>
     </w:p>
     <w:p>
@@ -657,29 +631,13 @@
           <w:b/>
           <w:bCs/>
         </w:rPr>
-        <w:t xml:space="preserve">Doctor of Technology, Interdisciplinary</w:t>
+        <w:t xml:space="preserve">CISSP.</w:t>
       </w:r>
       <w:r>
         <w:t xml:space="preserve"> </w:t>
       </w:r>
       <w:r>
-        <w:t xml:space="preserve">— Purdue University · Target completion ~May 2027 · Dissertation:</w:t>
-      </w:r>
-      <w:r>
-        <w:t xml:space="preserve"> </w:t>
-      </w:r>
-      <w:r>
-        <w:rPr>
-          <w:i/>
-          <w:iCs/>
-        </w:rPr>
-        <w:t xml:space="preserve">Operational Divergence in Air-Gapped LLMs</w:t>
-      </w:r>
-      <w:r>
-        <w:t xml:space="preserve"> </w:t>
-      </w:r>
-      <w:r>
-        <w:t xml:space="preserve">— measuring and bounding frontier-model behavior drift in offline / compliance-bounded deployments. Prelim Spring 2027.</w:t>
+        <w:t xml:space="preserve">ISC2. Issued Jan 2026.</w:t>
       </w:r>
     </w:p>
     <w:p>
@@ -691,14 +649,7 @@
         </w:numPr>
       </w:pPr>
       <w:r>
-        <w:rPr>
-          <w:b/>
-          <w:bCs/>
-        </w:rPr>
-        <w:t xml:space="preserve">M.S. Computer Science (ML)</w:t>
-      </w:r>
-      <w:r>
-        <w:t xml:space="preserve">, Computational Perception &amp; Robotics — Georgia Institute of Technology · May 2022</w:t>
+        <w:t xml:space="preserve">Active TS/SCI Clearance.</w:t>
       </w:r>
     </w:p>
     <w:p>
@@ -710,17 +661,19 @@
         </w:numPr>
       </w:pPr>
       <w:r>
-        <w:rPr>
-          <w:b/>
-          <w:bCs/>
-        </w:rPr>
-        <w:t xml:space="preserve">B.S. Computer Science, Information Assurance</w:t>
-      </w:r>
-      <w:r>
-        <w:t xml:space="preserve"> </w:t>
-      </w:r>
-      <w:r>
-        <w:t xml:space="preserve">— Jacksonville State University · May 2015</w:t>
+        <w:t xml:space="preserve">SAFe Certified (2025).</w:t>
+      </w:r>
+    </w:p>
+    <w:p>
+      <w:pPr>
+        <w:pStyle w:val="Compact"/>
+        <w:numPr>
+          <w:ilvl w:val="0"/>
+          <w:numId w:val="1009"/>
+        </w:numPr>
+      </w:pPr>
+      <w:r>
+        <w:t xml:space="preserve">Ethical Research Code of Conduct (2024).</w:t>
       </w:r>
     </w:p>
     <w:p>
@@ -730,96 +683,22 @@
         </w:pict>
       </w:r>
     </w:p>
-    <w:bookmarkEnd w:id="17"/>
-    <w:bookmarkStart w:id="18" w:name="credentials"/>
+    <w:bookmarkEnd w:id="18"/>
+    <w:bookmarkStart w:id="19" w:name="communities-speaking"/>
     <w:p>
       <w:pPr>
         <w:pStyle w:val="Heading2"/>
       </w:pPr>
       <w:r>
-        <w:t xml:space="preserve">CREDENTIALS</w:t>
-      </w:r>
-    </w:p>
-    <w:p>
-      <w:pPr>
-        <w:pStyle w:val="Compact"/>
-        <w:numPr>
-          <w:ilvl w:val="0"/>
-          <w:numId w:val="1010"/>
-        </w:numPr>
-      </w:pPr>
-      <w:r>
-        <w:rPr>
-          <w:b/>
-          <w:bCs/>
-        </w:rPr>
-        <w:t xml:space="preserve">CISSP</w:t>
-      </w:r>
-      <w:r>
-        <w:t xml:space="preserve"> </w:t>
-      </w:r>
-      <w:r>
-        <w:t xml:space="preserve">— Certified Information Systems Security Professional (ISC2, Jan 2026)</w:t>
-      </w:r>
-    </w:p>
-    <w:p>
-      <w:pPr>
-        <w:pStyle w:val="Compact"/>
-        <w:numPr>
-          <w:ilvl w:val="0"/>
-          <w:numId w:val="1010"/>
-        </w:numPr>
-      </w:pPr>
-      <w:r>
-        <w:rPr>
-          <w:b/>
-          <w:bCs/>
-        </w:rPr>
-        <w:t xml:space="preserve">Active TS/SCI Clearance</w:t>
-      </w:r>
-    </w:p>
-    <w:p>
-      <w:pPr>
-        <w:pStyle w:val="Compact"/>
-        <w:numPr>
-          <w:ilvl w:val="0"/>
-          <w:numId w:val="1010"/>
-        </w:numPr>
-      </w:pPr>
-      <w:r>
-        <w:rPr>
-          <w:b/>
-          <w:bCs/>
-        </w:rPr>
-        <w:t xml:space="preserve">SAFe Certified</w:t>
-      </w:r>
-      <w:r>
-        <w:t xml:space="preserve"> </w:t>
-      </w:r>
-      <w:r>
-        <w:t xml:space="preserve">(2025)</w:t>
-      </w:r>
-    </w:p>
-    <w:p>
-      <w:pPr>
-        <w:pStyle w:val="Compact"/>
-        <w:numPr>
-          <w:ilvl w:val="0"/>
-          <w:numId w:val="1010"/>
-        </w:numPr>
-      </w:pPr>
-      <w:r>
-        <w:rPr>
-          <w:b/>
-          <w:bCs/>
-        </w:rPr>
-        <w:t xml:space="preserve">Ethical Research Code of Conduct</w:t>
-      </w:r>
-      <w:r>
-        <w:t xml:space="preserve"> </w:t>
-      </w:r>
-      <w:r>
-        <w:t xml:space="preserve">(2024)</w:t>
+        <w:t xml:space="preserve">COMMUNITIES &amp; SPEAKING</w:t>
+      </w:r>
+    </w:p>
+    <w:p>
+      <w:pPr>
+        <w:pStyle w:val="FirstParagraph"/>
+      </w:pPr>
+      <w:r>
+        <w:t xml:space="preserve">I participate in and speak at software assurance, DevSecOps, and AI communities of practice.</w:t>
       </w:r>
     </w:p>
     <w:p>
@@ -827,70 +706,6 @@
         <w:pict>
           <v:rect style="width:0;height:1.5pt" o:hralign="center" o:hrstd="t" o:hr="t"/>
         </w:pict>
-      </w:r>
-    </w:p>
-    <w:bookmarkEnd w:id="18"/>
-    <w:bookmarkStart w:id="19" w:name="communities-speaking"/>
-    <w:p>
-      <w:pPr>
-        <w:pStyle w:val="Heading2"/>
-      </w:pPr>
-      <w:r>
-        <w:t xml:space="preserve">COMMUNITIES &amp; SPEAKING</w:t>
-      </w:r>
-    </w:p>
-    <w:p>
-      <w:pPr>
-        <w:pStyle w:val="Compact"/>
-        <w:numPr>
-          <w:ilvl w:val="0"/>
-          <w:numId w:val="1011"/>
-        </w:numPr>
-      </w:pPr>
-      <w:r>
-        <w:t xml:space="preserve">Active participant, contributor, and speaker in</w:t>
-      </w:r>
-      <w:r>
-        <w:t xml:space="preserve"> </w:t>
-      </w:r>
-      <w:r>
-        <w:rPr>
-          <w:b/>
-          <w:bCs/>
-        </w:rPr>
-        <w:t xml:space="preserve">software assurance</w:t>
-      </w:r>
-      <w:r>
-        <w:t xml:space="preserve">,</w:t>
-      </w:r>
-      <w:r>
-        <w:t xml:space="preserve"> </w:t>
-      </w:r>
-      <w:r>
-        <w:rPr>
-          <w:b/>
-          <w:bCs/>
-        </w:rPr>
-        <w:t xml:space="preserve">DevSecOps</w:t>
-      </w:r>
-      <w:r>
-        <w:t xml:space="preserve">, and</w:t>
-      </w:r>
-      <w:r>
-        <w:t xml:space="preserve"> </w:t>
-      </w:r>
-      <w:r>
-        <w:rPr>
-          <w:b/>
-          <w:bCs/>
-        </w:rPr>
-        <w:t xml:space="preserve">AI</w:t>
-      </w:r>
-      <w:r>
-        <w:t xml:space="preserve"> </w:t>
-      </w:r>
-      <w:r>
-        <w:t xml:space="preserve">communities of practice.</w:t>
       </w:r>
     </w:p>
     <w:bookmarkEnd w:id="19"/>
@@ -918,7 +733,7 @@
         <w:t xml:space="preserve"> </w:t>
       </w:r>
       <w:r>
-        <w:t xml:space="preserve">Neural networks, deep learning, computer vision, digital signal processing, supervised + unsupervised learning, transfer learning, LLM deployment, retrieval-augmented generation, evaluation pipelines.</w:t>
+        <w:t xml:space="preserve">Neural networks, deep learning, computer vision, digital signal processing. Supervised and unsupervised learning. Transfer learning. LLM deployment, retrieval-augmented generation, evaluation pipelines.</w:t>
       </w:r>
     </w:p>
     <w:p>
@@ -930,7 +745,7 @@
           <w:b/>
           <w:bCs/>
         </w:rPr>
-        <w:t xml:space="preserve">Robotics &amp; Autonomous Systems.</w:t>
+        <w:t xml:space="preserve">Robotics &amp; autonomous systems.</w:t>
       </w:r>
       <w:r>
         <w:t xml:space="preserve"> </w:t>
@@ -948,13 +763,13 @@
           <w:b/>
           <w:bCs/>
         </w:rPr>
-        <w:t xml:space="preserve">Security &amp; Compliance.</w:t>
+        <w:t xml:space="preserve">Security &amp; compliance.</w:t>
       </w:r>
       <w:r>
         <w:t xml:space="preserve"> </w:t>
       </w:r>
       <w:r>
-        <w:t xml:space="preserve">CISSP-credentialed; STIGs, software assurance, compliance-bounded deployment, air-gapped / offline-inference environments, hardened production systems.</w:t>
+        <w:t xml:space="preserve">CISSP. STIGs, software assurance, compliance-bounded deployment, air-gapped and offline-inference environments, hardened production systems.</w:t>
       </w:r>
     </w:p>
     <w:p>
@@ -966,13 +781,13 @@
           <w:b/>
           <w:bCs/>
         </w:rPr>
-        <w:t xml:space="preserve">Platform &amp; Infrastructure.</w:t>
+        <w:t xml:space="preserve">Platform &amp; infrastructure.</w:t>
       </w:r>
       <w:r>
         <w:t xml:space="preserve"> </w:t>
       </w:r>
       <w:r>
-        <w:t xml:space="preserve">MLOps, DevSecOps, containerized microservices (Docker), hybrid cloud, CI/CD, Linux/Bash, distributed computing, petabyte-scale data pipelines, Hadoop.</w:t>
+        <w:t xml:space="preserve">MLOps, DevSecOps, containerized microservices (Docker), hybrid cloud, CI/CD, distributed computing, petabyte-scale data pipelines, Hadoop.</w:t>
       </w:r>
     </w:p>
     <w:p>
@@ -984,32 +799,25 @@
           <w:b/>
           <w:bCs/>
         </w:rPr>
-        <w:t xml:space="preserve">Languages &amp; Tooling.</w:t>
+        <w:t xml:space="preserve">Languages &amp; tooling.</w:t>
       </w:r>
       <w:r>
         <w:t xml:space="preserve"> </w:t>
       </w:r>
       <w:r>
-        <w:t xml:space="preserve">Python (primary), TensorFlow, Git/GitLab/GitHub. Cross-platform fluent: Linux, Windows, and WSL2 development environments.</w:t>
-      </w:r>
-    </w:p>
-    <w:p>
-      <w:r>
-        <w:pict>
-          <v:rect style="width:0;height:1.5pt" o:hralign="center" o:hrstd="t" o:hr="t"/>
-        </w:pict>
-      </w:r>
-    </w:p>
-    <w:p>
-      <w:pPr>
-        <w:pStyle w:val="FirstParagraph"/>
+        <w:t xml:space="preserve">Python is my primary. TensorFlow. Git, GitLab, GitHub. Comfortable across Linux, Windows, and WSL2.</w:t>
+      </w:r>
+    </w:p>
+    <w:p>
+      <w:pPr>
+        <w:pStyle w:val="BodyText"/>
       </w:pPr>
       <w:r>
         <w:rPr>
           <w:i/>
           <w:iCs/>
         </w:rPr>
-        <w:t xml:space="preserve">References available on request.</w:t>
+        <w:t xml:space="preserve">References on request.</w:t>
       </w:r>
     </w:p>
     <w:bookmarkEnd w:id="20"/>
@@ -1367,12 +1175,6 @@
     <w:abstractNumId w:val="991"/>
   </w:num>
   <w:num w:numId="1009">
-    <w:abstractNumId w:val="991"/>
-  </w:num>
-  <w:num w:numId="1010">
-    <w:abstractNumId w:val="991"/>
-  </w:num>
-  <w:num w:numId="1011">
     <w:abstractNumId w:val="991"/>
   </w:num>
 </w:numbering>

</xml_diff>